<commit_message>
Aggiunta eccezione se inserita una data in acquisto
</commit_message>
<xml_diff>
--- a/Relazione_Progetto_Esame.docx
+++ b/Relazione_Progetto_Esame.docx
@@ -413,7 +413,119 @@
       </w:pPr>
       <w:r>
         <w:rPr/>
-        <w:t xml:space="preserve">presenta </w:t>
+        <w:t>presenta 7 campi: codice, utente, tipologia, articolo, prezzo, parolaChiave, scadenza:</w:t>
+      </w:r>
+    </w:p>
+    <w:p>
+      <w:pPr>
+        <w:pStyle w:val="Normal"/>
+        <w:numPr>
+          <w:ilvl w:val="0"/>
+          <w:numId w:val="4"/>
+        </w:numPr>
+        <w:bidi w:val="0"/>
+        <w:jc w:val="start"/>
+        <w:rPr/>
+      </w:pPr>
+      <w:r>
+        <w:rPr/>
+        <w:t>1) il campo codice, di tipo int, rappresenta il codice univoco di ogni annuncio, tale codice comincerà da 1 e a ogni annuncio creato dopo verrà sommato 1.</w:t>
+      </w:r>
+    </w:p>
+    <w:p>
+      <w:pPr>
+        <w:pStyle w:val="Normal"/>
+        <w:numPr>
+          <w:ilvl w:val="0"/>
+          <w:numId w:val="4"/>
+        </w:numPr>
+        <w:bidi w:val="0"/>
+        <w:jc w:val="start"/>
+        <w:rPr/>
+      </w:pPr>
+      <w:r>
+        <w:rPr/>
+        <w:t>2) il campo utente, di tipo Utente, rappresenta l’utente che intende eseguire le operazioni sugli annunci.</w:t>
+      </w:r>
+    </w:p>
+    <w:p>
+      <w:pPr>
+        <w:pStyle w:val="Normal"/>
+        <w:numPr>
+          <w:ilvl w:val="0"/>
+          <w:numId w:val="4"/>
+        </w:numPr>
+        <w:bidi w:val="0"/>
+        <w:jc w:val="start"/>
+        <w:rPr/>
+      </w:pPr>
+      <w:r>
+        <w:rPr/>
+        <w:t>3) il campo tipologia, di tipo char, rappresenta se l’annuncio è un acquisto o una vendita, vendendo indicato con ‘a’ per acquisto e ‘v’ per vendita.</w:t>
+      </w:r>
+    </w:p>
+    <w:p>
+      <w:pPr>
+        <w:pStyle w:val="Normal"/>
+        <w:numPr>
+          <w:ilvl w:val="0"/>
+          <w:numId w:val="4"/>
+        </w:numPr>
+        <w:bidi w:val="0"/>
+        <w:jc w:val="start"/>
+        <w:rPr/>
+      </w:pPr>
+      <w:r>
+        <w:rPr/>
+        <w:t>4) il campo articolo, di tipo String, rappresenta il nome dell’articolo che si desidera vendere o acquistare.</w:t>
+      </w:r>
+    </w:p>
+    <w:p>
+      <w:pPr>
+        <w:pStyle w:val="Normal"/>
+        <w:numPr>
+          <w:ilvl w:val="0"/>
+          <w:numId w:val="4"/>
+        </w:numPr>
+        <w:bidi w:val="0"/>
+        <w:jc w:val="start"/>
+        <w:rPr/>
+      </w:pPr>
+      <w:r>
+        <w:rPr/>
+        <w:t>5) il campo prezzo, di tipo double, rappresenta in modo decimale il prezzo dell’articolo scelto.</w:t>
+      </w:r>
+    </w:p>
+    <w:p>
+      <w:pPr>
+        <w:pStyle w:val="Normal"/>
+        <w:numPr>
+          <w:ilvl w:val="0"/>
+          <w:numId w:val="4"/>
+        </w:numPr>
+        <w:bidi w:val="0"/>
+        <w:jc w:val="start"/>
+        <w:rPr/>
+      </w:pPr>
+      <w:r>
+        <w:rPr/>
+        <w:t>6) il campo parolaChiave, di tipo char, rappresenta le parole chiave che l’utente può inserire per favorire la ricerca di articoli simili tra loro, viene inizializzata a una stringa vuota essendo un campo facoltativo, quindi non inserendo nessuna parola chiave non risulterà null.</w:t>
+      </w:r>
+    </w:p>
+    <w:p>
+      <w:pPr>
+        <w:pStyle w:val="Normal"/>
+        <w:numPr>
+          <w:ilvl w:val="0"/>
+          <w:numId w:val="4"/>
+        </w:numPr>
+        <w:bidi w:val="0"/>
+        <w:jc w:val="start"/>
+        <w:rPr/>
+      </w:pPr>
+      <w:r>
+        <w:rPr/>
+        <w:t xml:space="preserve">7) il campo scadenza, di tipo LocalDate, rappresenta la scadenza del </w:t>
       </w:r>
     </w:p>
     <w:sectPr>

</xml_diff>